<commit_message>
upto feb 19 offline class + feb 19 hw done
</commit_message>
<xml_diff>
--- a/Collection types.docx
+++ b/Collection types.docx
@@ -9,12 +9,12 @@
         <w:tblLook w:val="04A0" w:firstRow="1" w:lastRow="0" w:firstColumn="1" w:lastColumn="0" w:noHBand="0" w:noVBand="1"/>
       </w:tblPr>
       <w:tblGrid>
-        <w:gridCol w:w="1297"/>
+        <w:gridCol w:w="1345"/>
         <w:gridCol w:w="2369"/>
-        <w:gridCol w:w="1355"/>
-        <w:gridCol w:w="1199"/>
-        <w:gridCol w:w="1231"/>
-        <w:gridCol w:w="1565"/>
+        <w:gridCol w:w="1390"/>
+        <w:gridCol w:w="1271"/>
+        <w:gridCol w:w="1295"/>
+        <w:gridCol w:w="1346"/>
       </w:tblGrid>
       <w:tr>
         <w:tc>
@@ -157,13 +157,17 @@
           </w:tcPr>
           <w:p>
             <w:r>
-              <w:t>print(dir(</w:t>
-            </w:r>
-            <w:r>
-              <w:t>str</w:t>
-            </w:r>
-            <w:r>
-              <w:t>))</w:t>
+              <w:t>Upper()</w:t>
+            </w:r>
+          </w:p>
+          <w:p>
+            <w:r>
+              <w:t>Casefold()</w:t>
+            </w:r>
+          </w:p>
+          <w:p>
+            <w:r>
+              <w:t>Find()</w:t>
             </w:r>
           </w:p>
           <w:p/>
@@ -234,10 +238,24 @@
           </w:tcPr>
           <w:p>
             <w:r>
-              <w:t>print(dir(list))</w:t>
-            </w:r>
-          </w:p>
-          <w:p/>
+              <w:t>Append()</w:t>
+            </w:r>
+          </w:p>
+          <w:p>
+            <w:r>
+              <w:t>Insert()</w:t>
+            </w:r>
+          </w:p>
+          <w:p>
+            <w:r>
+              <w:t>Remove()</w:t>
+            </w:r>
+          </w:p>
+          <w:p>
+            <w:r>
+              <w:t>Copy()</w:t>
+            </w:r>
+          </w:p>
         </w:tc>
       </w:tr>
       <w:tr>
@@ -255,31 +273,56 @@
           <w:tcPr>
             <w:tcW w:w="1502" w:type="dxa"/>
           </w:tcPr>
-          <w:p/>
-        </w:tc>
-        <w:tc>
-          <w:tcPr>
-            <w:tcW w:w="1503" w:type="dxa"/>
-          </w:tcPr>
-          <w:p/>
-        </w:tc>
-        <w:tc>
-          <w:tcPr>
-            <w:tcW w:w="1503" w:type="dxa"/>
-          </w:tcPr>
-          <w:p/>
-        </w:tc>
-        <w:tc>
-          <w:tcPr>
-            <w:tcW w:w="1503" w:type="dxa"/>
-          </w:tcPr>
-          <w:p/>
-        </w:tc>
-        <w:tc>
-          <w:tcPr>
-            <w:tcW w:w="1503" w:type="dxa"/>
-          </w:tcPr>
-          <w:p/>
+          <w:p>
+            <w:r>
+              <w:t>Tup = (100,200,300)</w:t>
+            </w:r>
+          </w:p>
+        </w:tc>
+        <w:tc>
+          <w:tcPr>
+            <w:tcW w:w="1503" w:type="dxa"/>
+          </w:tcPr>
+          <w:p>
+            <w:r>
+              <w:t xml:space="preserve">Immutable </w:t>
+            </w:r>
+          </w:p>
+        </w:tc>
+        <w:tc>
+          <w:tcPr>
+            <w:tcW w:w="1503" w:type="dxa"/>
+          </w:tcPr>
+          <w:p>
+            <w:r>
+              <w:t>yes</w:t>
+            </w:r>
+          </w:p>
+        </w:tc>
+        <w:tc>
+          <w:tcPr>
+            <w:tcW w:w="1503" w:type="dxa"/>
+          </w:tcPr>
+          <w:p>
+            <w:r>
+              <w:t>yes</w:t>
+            </w:r>
+          </w:p>
+        </w:tc>
+        <w:tc>
+          <w:tcPr>
+            <w:tcW w:w="1503" w:type="dxa"/>
+          </w:tcPr>
+          <w:p>
+            <w:r>
+              <w:t>Index()</w:t>
+            </w:r>
+          </w:p>
+          <w:p>
+            <w:r>
+              <w:t>Count()</w:t>
+            </w:r>
+          </w:p>
         </w:tc>
       </w:tr>
       <w:tr>
@@ -297,25 +340,46 @@
           <w:tcPr>
             <w:tcW w:w="1502" w:type="dxa"/>
           </w:tcPr>
-          <w:p/>
-        </w:tc>
-        <w:tc>
-          <w:tcPr>
-            <w:tcW w:w="1503" w:type="dxa"/>
-          </w:tcPr>
-          <w:p/>
-        </w:tc>
-        <w:tc>
-          <w:tcPr>
-            <w:tcW w:w="1503" w:type="dxa"/>
-          </w:tcPr>
-          <w:p/>
-        </w:tc>
-        <w:tc>
-          <w:tcPr>
-            <w:tcW w:w="1503" w:type="dxa"/>
-          </w:tcPr>
-          <w:p/>
+          <w:p>
+            <w:r>
+              <w:t>St={}</w:t>
+            </w:r>
+          </w:p>
+          <w:p>
+            <w:r>
+              <w:t>St = set()</w:t>
+            </w:r>
+          </w:p>
+        </w:tc>
+        <w:tc>
+          <w:tcPr>
+            <w:tcW w:w="1503" w:type="dxa"/>
+          </w:tcPr>
+          <w:p>
+            <w:r>
+              <w:t xml:space="preserve">Mutable </w:t>
+            </w:r>
+          </w:p>
+        </w:tc>
+        <w:tc>
+          <w:tcPr>
+            <w:tcW w:w="1503" w:type="dxa"/>
+          </w:tcPr>
+          <w:p>
+            <w:r>
+              <w:t>no</w:t>
+            </w:r>
+          </w:p>
+        </w:tc>
+        <w:tc>
+          <w:tcPr>
+            <w:tcW w:w="1503" w:type="dxa"/>
+          </w:tcPr>
+          <w:p>
+            <w:r>
+              <w:t>no</w:t>
+            </w:r>
+          </w:p>
         </w:tc>
         <w:tc>
           <w:tcPr>
@@ -339,25 +403,41 @@
           <w:tcPr>
             <w:tcW w:w="1502" w:type="dxa"/>
           </w:tcPr>
-          <w:p/>
-        </w:tc>
-        <w:tc>
-          <w:tcPr>
-            <w:tcW w:w="1503" w:type="dxa"/>
-          </w:tcPr>
-          <w:p/>
-        </w:tc>
-        <w:tc>
-          <w:tcPr>
-            <w:tcW w:w="1503" w:type="dxa"/>
-          </w:tcPr>
-          <w:p/>
-        </w:tc>
-        <w:tc>
-          <w:tcPr>
-            <w:tcW w:w="1503" w:type="dxa"/>
-          </w:tcPr>
-          <w:p/>
+          <w:p>
+            <w:r>
+              <w:t>Dict = {key: value}</w:t>
+            </w:r>
+          </w:p>
+        </w:tc>
+        <w:tc>
+          <w:tcPr>
+            <w:tcW w:w="1503" w:type="dxa"/>
+          </w:tcPr>
+          <w:p>
+            <w:r>
+              <w:t xml:space="preserve">Mutable </w:t>
+            </w:r>
+          </w:p>
+        </w:tc>
+        <w:tc>
+          <w:tcPr>
+            <w:tcW w:w="1503" w:type="dxa"/>
+          </w:tcPr>
+          <w:p>
+            <w:r>
+              <w:t>yes</w:t>
+            </w:r>
+          </w:p>
+        </w:tc>
+        <w:tc>
+          <w:tcPr>
+            <w:tcW w:w="1503" w:type="dxa"/>
+          </w:tcPr>
+          <w:p>
+            <w:r>
+              <w:t>no</w:t>
+            </w:r>
+          </w:p>
         </w:tc>
         <w:tc>
           <w:tcPr>
@@ -981,6 +1061,7 @@
   <w:style w:type="character" w:default="1" w:styleId="DefaultParagraphFont">
     <w:name w:val="Default Paragraph Font"/>
     <w:uiPriority w:val="1"/>
+    <w:semiHidden/>
     <w:unhideWhenUsed/>
   </w:style>
   <w:style w:type="table" w:default="1" w:styleId="TableNormal">

</xml_diff>

<commit_message>
till feb 25 offline class done
</commit_message>
<xml_diff>
--- a/Collection types.docx
+++ b/Collection types.docx
@@ -9,12 +9,12 @@
         <w:tblLook w:val="04A0" w:firstRow="1" w:lastRow="0" w:firstColumn="1" w:lastColumn="0" w:noHBand="0" w:noVBand="1"/>
       </w:tblPr>
       <w:tblGrid>
-        <w:gridCol w:w="1345"/>
-        <w:gridCol w:w="2369"/>
-        <w:gridCol w:w="1390"/>
-        <w:gridCol w:w="1271"/>
-        <w:gridCol w:w="1295"/>
-        <w:gridCol w:w="1346"/>
+        <w:gridCol w:w="1265"/>
+        <w:gridCol w:w="2321"/>
+        <w:gridCol w:w="1325"/>
+        <w:gridCol w:w="1167"/>
+        <w:gridCol w:w="1671"/>
+        <w:gridCol w:w="1267"/>
       </w:tblGrid>
       <w:tr>
         <w:tc>
@@ -49,7 +49,15 @@
               <w:t>utable</w:t>
             </w:r>
             <w:r>
-              <w:t xml:space="preserve"> ( can be updated or not? )</w:t>
+              <w:t xml:space="preserve"> </w:t>
+            </w:r>
+            <w:proofErr w:type="gramStart"/>
+            <w:r>
+              <w:t>( can</w:t>
+            </w:r>
+            <w:proofErr w:type="gramEnd"/>
+            <w:r>
+              <w:t xml:space="preserve"> be updated or not? )</w:t>
             </w:r>
           </w:p>
         </w:tc>
@@ -109,7 +117,20 @@
           </w:p>
           <w:p>
             <w:r>
-              <w:t>Company=”luminar”</w:t>
+              <w:t>Company</w:t>
+            </w:r>
+            <w:proofErr w:type="gramStart"/>
+            <w:r>
+              <w:t>=”</w:t>
+            </w:r>
+            <w:proofErr w:type="spellStart"/>
+            <w:r>
+              <w:t>luminar</w:t>
+            </w:r>
+            <w:proofErr w:type="spellEnd"/>
+            <w:proofErr w:type="gramEnd"/>
+            <w:r>
+              <w:t>”</w:t>
             </w:r>
           </w:p>
           <w:p>
@@ -117,7 +138,15 @@
               <w:t xml:space="preserve">Address = </w:t>
             </w:r>
             <w:r>
-              <w:t>“””addresses “””</w:t>
+              <w:t>“</w:t>
+            </w:r>
+            <w:proofErr w:type="gramStart"/>
+            <w:r>
+              <w:t>””addresses</w:t>
+            </w:r>
+            <w:proofErr w:type="gramEnd"/>
+            <w:r>
+              <w:t xml:space="preserve"> “””</w:t>
             </w:r>
           </w:p>
         </w:tc>
@@ -156,18 +185,38 @@
             <w:tcW w:w="1503" w:type="dxa"/>
           </w:tcPr>
           <w:p>
-            <w:r>
-              <w:t>Upper()</w:t>
-            </w:r>
-          </w:p>
-          <w:p>
-            <w:r>
-              <w:t>Casefold()</w:t>
-            </w:r>
-          </w:p>
-          <w:p>
-            <w:r>
-              <w:t>Find()</w:t>
+            <w:proofErr w:type="gramStart"/>
+            <w:r>
+              <w:t>Upper(</w:t>
+            </w:r>
+            <w:proofErr w:type="gramEnd"/>
+            <w:r>
+              <w:t>)</w:t>
+            </w:r>
+          </w:p>
+          <w:p>
+            <w:proofErr w:type="spellStart"/>
+            <w:proofErr w:type="gramStart"/>
+            <w:r>
+              <w:t>Casefold</w:t>
+            </w:r>
+            <w:proofErr w:type="spellEnd"/>
+            <w:r>
+              <w:t>(</w:t>
+            </w:r>
+            <w:proofErr w:type="gramEnd"/>
+            <w:r>
+              <w:t>)</w:t>
+            </w:r>
+          </w:p>
+          <w:p>
+            <w:proofErr w:type="gramStart"/>
+            <w:r>
+              <w:t>Find(</w:t>
+            </w:r>
+            <w:proofErr w:type="gramEnd"/>
+            <w:r>
+              <w:t>)</w:t>
             </w:r>
           </w:p>
           <w:p/>
@@ -189,16 +238,31 @@
             <w:tcW w:w="1502" w:type="dxa"/>
           </w:tcPr>
           <w:p>
+            <w:proofErr w:type="spellStart"/>
             <w:r>
               <w:t>Variable_name</w:t>
             </w:r>
+            <w:proofErr w:type="spellEnd"/>
             <w:r>
               <w:t xml:space="preserve"> = []</w:t>
             </w:r>
           </w:p>
           <w:p>
-            <w:r>
-              <w:t>Lst = list()</w:t>
+            <w:proofErr w:type="spellStart"/>
+            <w:r>
+              <w:t>Lst</w:t>
+            </w:r>
+            <w:proofErr w:type="spellEnd"/>
+            <w:r>
+              <w:t xml:space="preserve"> = </w:t>
+            </w:r>
+            <w:proofErr w:type="gramStart"/>
+            <w:r>
+              <w:t>list(</w:t>
+            </w:r>
+            <w:proofErr w:type="gramEnd"/>
+            <w:r>
+              <w:t>)</w:t>
             </w:r>
           </w:p>
         </w:tc>
@@ -237,23 +301,43 @@
             <w:tcW w:w="1503" w:type="dxa"/>
           </w:tcPr>
           <w:p>
-            <w:r>
-              <w:t>Append()</w:t>
-            </w:r>
-          </w:p>
-          <w:p>
-            <w:r>
-              <w:t>Insert()</w:t>
-            </w:r>
-          </w:p>
-          <w:p>
-            <w:r>
-              <w:t>Remove()</w:t>
-            </w:r>
-          </w:p>
-          <w:p>
-            <w:r>
-              <w:t>Copy()</w:t>
+            <w:proofErr w:type="gramStart"/>
+            <w:r>
+              <w:t>Append(</w:t>
+            </w:r>
+            <w:proofErr w:type="gramEnd"/>
+            <w:r>
+              <w:t>)</w:t>
+            </w:r>
+          </w:p>
+          <w:p>
+            <w:proofErr w:type="gramStart"/>
+            <w:r>
+              <w:t>Insert(</w:t>
+            </w:r>
+            <w:proofErr w:type="gramEnd"/>
+            <w:r>
+              <w:t>)</w:t>
+            </w:r>
+          </w:p>
+          <w:p>
+            <w:proofErr w:type="gramStart"/>
+            <w:r>
+              <w:t>Remove(</w:t>
+            </w:r>
+            <w:proofErr w:type="gramEnd"/>
+            <w:r>
+              <w:t>)</w:t>
+            </w:r>
+          </w:p>
+          <w:p>
+            <w:proofErr w:type="gramStart"/>
+            <w:r>
+              <w:t>Copy(</w:t>
+            </w:r>
+            <w:proofErr w:type="gramEnd"/>
+            <w:r>
+              <w:t>)</w:t>
             </w:r>
           </w:p>
         </w:tc>
@@ -314,13 +398,23 @@
             <w:tcW w:w="1503" w:type="dxa"/>
           </w:tcPr>
           <w:p>
-            <w:r>
-              <w:t>Index()</w:t>
-            </w:r>
-          </w:p>
-          <w:p>
-            <w:r>
-              <w:t>Count()</w:t>
+            <w:proofErr w:type="gramStart"/>
+            <w:r>
+              <w:t>Index(</w:t>
+            </w:r>
+            <w:proofErr w:type="gramEnd"/>
+            <w:r>
+              <w:t>)</w:t>
+            </w:r>
+          </w:p>
+          <w:p>
+            <w:proofErr w:type="gramStart"/>
+            <w:r>
+              <w:t>Count(</w:t>
+            </w:r>
+            <w:proofErr w:type="gramEnd"/>
+            <w:r>
+              <w:t>)</w:t>
             </w:r>
           </w:p>
         </w:tc>
@@ -342,12 +436,28 @@
           </w:tcPr>
           <w:p>
             <w:r>
-              <w:t>St={}</w:t>
-            </w:r>
-          </w:p>
-          <w:p>
-            <w:r>
-              <w:t>St = set()</w:t>
+              <w:t>St</w:t>
+            </w:r>
+            <w:proofErr w:type="gramStart"/>
+            <w:r>
+              <w:t>={</w:t>
+            </w:r>
+            <w:proofErr w:type="gramEnd"/>
+            <w:r>
+              <w:t>}</w:t>
+            </w:r>
+          </w:p>
+          <w:p>
+            <w:r>
+              <w:t xml:space="preserve">St = </w:t>
+            </w:r>
+            <w:proofErr w:type="gramStart"/>
+            <w:r>
+              <w:t>set(</w:t>
+            </w:r>
+            <w:proofErr w:type="gramEnd"/>
+            <w:r>
+              <w:t>)</w:t>
             </w:r>
           </w:p>
         </w:tc>
@@ -404,8 +514,13 @@
             <w:tcW w:w="1502" w:type="dxa"/>
           </w:tcPr>
           <w:p>
-            <w:r>
-              <w:t>Dict = {key: value}</w:t>
+            <w:proofErr w:type="spellStart"/>
+            <w:r>
+              <w:t>Dict</w:t>
+            </w:r>
+            <w:proofErr w:type="spellEnd"/>
+            <w:r>
+              <w:t xml:space="preserve"> = {key: value}</w:t>
             </w:r>
           </w:p>
         </w:tc>
@@ -425,17 +540,27 @@
           </w:tcPr>
           <w:p>
             <w:r>
-              <w:t>yes</w:t>
-            </w:r>
-          </w:p>
-        </w:tc>
-        <w:tc>
-          <w:tcPr>
-            <w:tcW w:w="1503" w:type="dxa"/>
-          </w:tcPr>
-          <w:p>
-            <w:r>
-              <w:t>no</w:t>
+              <w:t>No matter</w:t>
+            </w:r>
+          </w:p>
+        </w:tc>
+        <w:tc>
+          <w:tcPr>
+            <w:tcW w:w="1503" w:type="dxa"/>
+          </w:tcPr>
+          <w:p>
+            <w:r>
+              <w:t> a dictionary </w:t>
+            </w:r>
+            <w:r>
+              <w:rPr>
+                <w:b/>
+                <w:bCs/>
+              </w:rPr>
+              <w:t>can have duplicate values</w:t>
+            </w:r>
+            <w:r>
+              <w:t>, but it cannot have duplicate keys.</w:t>
             </w:r>
           </w:p>
         </w:tc>
@@ -1061,7 +1186,6 @@
   <w:style w:type="character" w:default="1" w:styleId="DefaultParagraphFont">
     <w:name w:val="Default Paragraph Font"/>
     <w:uiPriority w:val="1"/>
-    <w:semiHidden/>
     <w:unhideWhenUsed/>
   </w:style>
   <w:style w:type="table" w:default="1" w:styleId="TableNormal">

</xml_diff>